<commit_message>
Práctica 6 traducida. Soluciones incorporadas a reloj_resuelta.s. Pequeños cambios en otras partes
</commit_message>
<xml_diff>
--- a/ETC_RISCV/Laboratorio/Práctica 05 - Aritmética de enteros. Multiplicación y división - Castellano - RISC-V.docx
+++ b/ETC_RISCV/Laboratorio/Práctica 05 - Aritmética de enteros. Multiplicación y división - Castellano - RISC-V.docx
@@ -489,7 +489,7 @@
           <w:noProof/>
           <w:kern w:val="32"/>
         </w:rPr>
-        <w:pict w14:anchorId="2FBC45A9">
+        <w:pict w14:anchorId="4D530FE4">
           <v:group id="_x0000_s1026" alt="" style="position:absolute;left:0;text-align:left;margin-left:87.35pt;margin-top:.35pt;width:285.6pt;height:28.3pt;z-index:251671552" coordorigin="2881,1977" coordsize="5712,566">
             <v:rect id="_x0000_s1027" alt="" style="position:absolute;left:7484;top:2302;width:1109;height:241;mso-wrap-style:square;v-text-anchor:middle" stroked="f">
               <v:textbox style="mso-next-textbox:#_x0000_s1027" inset="0,.3mm,0,.3mm">
@@ -1244,7 +1244,13 @@
         <w:rPr>
           <w:kern w:val="32"/>
         </w:rPr>
-        <w:t>. A continuación referimos los elementos más significativos de la declaración de variables y del programa principal.</w:t>
+        <w:t xml:space="preserve">, disponible en Poliformat. </w:t>
+      </w:r>
+      <w:r>
+        <w:rPr>
+          <w:kern w:val="32"/>
+        </w:rPr>
+        <w:t>A continuación referimos los elementos más significativos de la declaración de variables y del programa principal.</w:t>
       </w:r>
     </w:p>
     <w:p>
@@ -1926,27 +1932,7 @@
                 <w:szCs w:val="18"/>
                 <w:lang w:val="es-ES_tradnl"/>
               </w:rPr>
-              <w:t xml:space="preserve">    </w:t>
-            </w:r>
-            <w:r>
-              <w:rPr>
-                <w:rFonts w:ascii="Courier New" w:hAnsi="Courier New" w:cs="Courier New"/>
-                <w:color w:val="000000" w:themeColor="text1"/>
-                <w:sz w:val="18"/>
-                <w:szCs w:val="18"/>
-                <w:lang w:val="es-ES_tradnl"/>
-              </w:rPr>
-              <w:t xml:space="preserve">     </w:t>
-            </w:r>
-            <w:r>
-              <w:rPr>
-                <w:rFonts w:ascii="Courier New" w:hAnsi="Courier New" w:cs="Courier New"/>
-                <w:color w:val="000000" w:themeColor="text1"/>
-                <w:sz w:val="18"/>
-                <w:szCs w:val="18"/>
-                <w:lang w:val="es-ES_tradnl"/>
-              </w:rPr>
-              <w:t>jal ra,imprime_reloj</w:t>
+              <w:t xml:space="preserve">         jal ra,imprime_reloj</w:t>
             </w:r>
           </w:p>
           <w:p>
@@ -2076,27 +2062,7 @@
                 <w:szCs w:val="18"/>
                 <w:lang w:val="es-ES_tradnl"/>
               </w:rPr>
-              <w:t xml:space="preserve">    </w:t>
-            </w:r>
-            <w:r>
-              <w:rPr>
-                <w:rFonts w:ascii="Courier New" w:hAnsi="Courier New" w:cs="Courier New"/>
-                <w:color w:val="000000" w:themeColor="text1"/>
-                <w:sz w:val="18"/>
-                <w:szCs w:val="18"/>
-                <w:lang w:val="es-ES_tradnl"/>
-              </w:rPr>
-              <w:t xml:space="preserve">     </w:t>
-            </w:r>
-            <w:r>
-              <w:rPr>
-                <w:rFonts w:ascii="Courier New" w:hAnsi="Courier New" w:cs="Courier New"/>
-                <w:color w:val="000000" w:themeColor="text1"/>
-                <w:sz w:val="18"/>
-                <w:szCs w:val="18"/>
-                <w:lang w:val="es-ES_tradnl"/>
-              </w:rPr>
-              <w:t>ecall</w:t>
+              <w:t xml:space="preserve">         ecall</w:t>
             </w:r>
           </w:p>
           <w:p>
@@ -4107,15 +4073,7 @@
                 <w:bCs/>
                 <w:sz w:val="20"/>
               </w:rPr>
-              <w:t xml:space="preserve">           </w:t>
-            </w:r>
-            <w:r>
-              <w:rPr>
-                <w:rFonts w:ascii="Courier New" w:hAnsi="Courier New" w:cs="Courier New"/>
-                <w:bCs/>
-                <w:sz w:val="20"/>
-              </w:rPr>
-              <w:t>ret</w:t>
+              <w:t xml:space="preserve">           ret</w:t>
             </w:r>
           </w:p>
           <w:p>
@@ -4303,13 +4261,7 @@
         <w:rPr>
           <w:rFonts w:ascii="Courier New" w:hAnsi="Courier New" w:cs="Courier New"/>
         </w:rPr>
-        <w:t>mulh</w:t>
-      </w:r>
-      <w:r>
-        <w:rPr>
-          <w:rFonts w:ascii="Courier New" w:hAnsi="Courier New" w:cs="Courier New"/>
-        </w:rPr>
-        <w:t>u</w:t>
+        <w:t>mulhu</w:t>
       </w:r>
       <w:r>
         <w:t xml:space="preserve"> calculan en los dos casos los 32 bits más significativos, teniendo en cuenta el signo de los operandos.</w:t>
@@ -4369,13 +4321,7 @@
         <w:rPr>
           <w:rFonts w:ascii="Courier New" w:hAnsi="Courier New" w:cs="Courier New"/>
         </w:rPr>
-        <w:t>h</w:t>
-      </w:r>
-      <w:r>
-        <w:rPr>
-          <w:rFonts w:ascii="Courier New" w:hAnsi="Courier New" w:cs="Courier New"/>
-        </w:rPr>
-        <w:t>.</w:t>
+        <w:t>h.</w:t>
       </w:r>
       <w:r>
         <w:t xml:space="preserve"> </w:t>
@@ -4647,16 +4593,7 @@
                 <w:sz w:val="18"/>
                 <w:lang w:val="en-US"/>
               </w:rPr>
-              <w:t xml:space="preserve">   # </w:t>
-            </w:r>
-            <w:r>
-              <w:rPr>
-                <w:rFonts w:ascii="Courier New" w:hAnsi="Courier New" w:cs="Courier New"/>
-                <w:bCs/>
-                <w:sz w:val="18"/>
-                <w:lang w:val="en-US"/>
-              </w:rPr>
-              <w:t>s1</w:t>
+              <w:t xml:space="preserve">   # s1</w:t>
             </w:r>
             <w:r>
               <w:rPr>
@@ -5950,9 +5887,68 @@
           <w:sz w:val="28"/>
           <w:lang w:eastAsia="en-US"/>
         </w:rPr>
-        <w:t>9</w:t>
-      </w:r>
-      <w:r>
+        <w:t xml:space="preserve">9 </w:t>
+      </w:r>
+    </w:p>
+    <w:p>
+      <w:r>
+        <w:lastRenderedPageBreak/>
+        <w:t xml:space="preserve">Se quiere completar </w:t>
+      </w:r>
+      <w:r>
+        <w:t xml:space="preserve">la subrutina </w:t>
+      </w:r>
+      <w:r>
+        <w:rPr>
+          <w:rFonts w:ascii="Courier New" w:hAnsi="Courier New" w:cs="Courier New"/>
+          <w:sz w:val="22"/>
+        </w:rPr>
+        <w:t>devuelve_reloj_en_s</w:t>
+      </w:r>
+      <w:r>
+        <w:t xml:space="preserve"> </w:t>
+      </w:r>
+      <w:r>
+        <w:t xml:space="preserve">con la detección de desbordamiento de la multiplicación. </w:t>
+      </w:r>
+      <w:r>
+        <w:t>Dado que estamos trabajando con números positivos,</w:t>
+      </w:r>
+      <w:r>
+        <w:t xml:space="preserve"> hay que incluir las instrucciones necesarias para detectar si, después de llevar a cabo la operación de multiplicación, el resultado ocupa más de 32 bits. En es</w:t>
+      </w:r>
+      <w:r>
+        <w:t>te</w:t>
+      </w:r>
+      <w:r>
+        <w:t xml:space="preserve"> </w:t>
+      </w:r>
+      <w:r>
+        <w:t xml:space="preserve">último </w:t>
+      </w:r>
+      <w:r>
+        <w:t xml:space="preserve">caso, hay que saltar a la etiqueta </w:t>
+      </w:r>
+      <w:r>
+        <w:rPr>
+          <w:rFonts w:ascii="Courier New" w:hAnsi="Courier New" w:cs="Courier New"/>
+          <w:bCs/>
+          <w:sz w:val="22"/>
+        </w:rPr>
+        <w:t>salir</w:t>
+      </w:r>
+      <w:r>
+        <w:t xml:space="preserve"> para terminar la ejecución del programa. Indique las instrucciones necesarias para esta detección de desbordamiento.</w:t>
+      </w:r>
+      <w:r>
+        <w:t xml:space="preserve"> </w:t>
+      </w:r>
+    </w:p>
+    <w:p>
+      <w:bookmarkStart w:id="1" w:name="_Toc297306454"/>
+    </w:p>
+    <w:p>
+      <w:pPr>
         <w:rPr>
           <w:rFonts w:ascii="Arial Bold" w:hAnsi="Arial Bold"/>
           <w:b/>
@@ -5960,68 +5956,8 @@
           <w:sz w:val="28"/>
           <w:lang w:eastAsia="en-US"/>
         </w:rPr>
-        <w:t xml:space="preserve"> </w:t>
-      </w:r>
-    </w:p>
-    <w:p>
-      <w:r>
-        <w:lastRenderedPageBreak/>
-        <w:t xml:space="preserve">Se quiere completar </w:t>
-      </w:r>
-      <w:r>
-        <w:t xml:space="preserve">la subrutina </w:t>
-      </w:r>
-      <w:r>
-        <w:rPr>
-          <w:rFonts w:ascii="Courier New" w:hAnsi="Courier New" w:cs="Courier New"/>
-          <w:sz w:val="22"/>
-        </w:rPr>
-        <w:t>devuelve_reloj_en_s</w:t>
-      </w:r>
-      <w:r>
-        <w:t xml:space="preserve"> </w:t>
-      </w:r>
-      <w:r>
-        <w:t xml:space="preserve">con la detección de desbordamiento de la multiplicación. </w:t>
-      </w:r>
-      <w:r>
-        <w:t>Dado que estamos trabajando con números positivos,</w:t>
-      </w:r>
-      <w:r>
-        <w:t xml:space="preserve"> hay que incluir las instrucciones necesarias para detectar si, después de llevar a cabo la operación de multiplicación, el resultado ocupa más de 32 bits. En es</w:t>
-      </w:r>
-      <w:r>
-        <w:t>te</w:t>
-      </w:r>
-      <w:r>
-        <w:t xml:space="preserve"> </w:t>
-      </w:r>
-      <w:r>
-        <w:t xml:space="preserve">último </w:t>
-      </w:r>
-      <w:r>
-        <w:t xml:space="preserve">caso, hay que saltar a la etiqueta </w:t>
-      </w:r>
-      <w:r>
-        <w:rPr>
-          <w:rFonts w:ascii="Courier New" w:hAnsi="Courier New" w:cs="Courier New"/>
-          <w:bCs/>
-          <w:sz w:val="22"/>
-        </w:rPr>
-        <w:t>salir</w:t>
-      </w:r>
-      <w:r>
-        <w:t xml:space="preserve"> para terminar la ejecución del programa. Indique las instrucciones necesarias para esta detección de desbordamiento.</w:t>
-      </w:r>
-      <w:r>
-        <w:t xml:space="preserve"> </w:t>
-      </w:r>
-    </w:p>
-    <w:p>
-      <w:bookmarkStart w:id="1" w:name="_Toc297306454"/>
-    </w:p>
-    <w:p>
-      <w:pPr>
+      </w:pPr>
+      <w:r>
         <w:rPr>
           <w:rFonts w:ascii="Arial Bold" w:hAnsi="Arial Bold"/>
           <w:b/>
@@ -6029,7 +5965,8 @@
           <w:sz w:val="28"/>
           <w:lang w:eastAsia="en-US"/>
         </w:rPr>
-      </w:pPr>
+        <w:t>E</w:t>
+      </w:r>
       <w:r>
         <w:rPr>
           <w:rFonts w:ascii="Arial Bold" w:hAnsi="Arial Bold"/>
@@ -6038,7 +5975,7 @@
           <w:sz w:val="28"/>
           <w:lang w:eastAsia="en-US"/>
         </w:rPr>
-        <w:t>E</w:t>
+        <w:t xml:space="preserve">jercicio </w:t>
       </w:r>
       <w:r>
         <w:rPr>
@@ -6048,9 +5985,35 @@
           <w:sz w:val="28"/>
           <w:lang w:eastAsia="en-US"/>
         </w:rPr>
-        <w:t xml:space="preserve">jercicio </w:t>
-      </w:r>
-      <w:r>
+        <w:t xml:space="preserve">10 </w:t>
+      </w:r>
+    </w:p>
+    <w:p>
+      <w:r>
+        <w:t>Supongamos que todas las instrucciones tardan un ciclo de reloj en ejecutarse y las de multiplicación tardan 20 ciclos. ¿Cuánto tiempo tarda en ejecutarse el código de</w:t>
+      </w:r>
+      <w:r>
+        <w:t xml:space="preserve"> </w:t>
+      </w:r>
+      <w:r>
+        <w:t>l</w:t>
+      </w:r>
+      <w:r>
+        <w:t>a</w:t>
+      </w:r>
+      <w:r>
+        <w:t xml:space="preserve"> </w:t>
+      </w:r>
+      <w:r>
+        <w:t>subrutina de conversión a segundos</w:t>
+      </w:r>
+      <w:r>
+        <w:t xml:space="preserve">? </w:t>
+      </w:r>
+    </w:p>
+    <w:p/>
+    <w:p>
+      <w:pPr>
         <w:rPr>
           <w:rFonts w:ascii="Arial Bold" w:hAnsi="Arial Bold"/>
           <w:b/>
@@ -6058,8 +6021,7 @@
           <w:sz w:val="28"/>
           <w:lang w:eastAsia="en-US"/>
         </w:rPr>
-        <w:t>10</w:t>
-      </w:r>
+      </w:pPr>
       <w:r>
         <w:rPr>
           <w:rFonts w:ascii="Arial Bold" w:hAnsi="Arial Bold"/>
@@ -6068,35 +6030,9 @@
           <w:sz w:val="28"/>
           <w:lang w:eastAsia="en-US"/>
         </w:rPr>
-        <w:t xml:space="preserve"> </w:t>
-      </w:r>
-    </w:p>
-    <w:p>
-      <w:r>
-        <w:t>Supongamos que todas las instrucciones tardan un ciclo de reloj en ejecutarse y las de multiplicación tardan 20 ciclos. ¿Cuánto tiempo tarda en ejecutarse el código de</w:t>
-      </w:r>
-      <w:r>
-        <w:t xml:space="preserve"> </w:t>
-      </w:r>
-      <w:r>
-        <w:t>l</w:t>
-      </w:r>
-      <w:r>
-        <w:t>a</w:t>
-      </w:r>
-      <w:r>
-        <w:t xml:space="preserve"> </w:t>
-      </w:r>
-      <w:r>
-        <w:t>subrutina de conversión a segundos</w:t>
-      </w:r>
-      <w:r>
-        <w:t xml:space="preserve">? </w:t>
-      </w:r>
-    </w:p>
-    <w:p/>
-    <w:p>
-      <w:pPr>
+        <w:t>E</w:t>
+      </w:r>
+      <w:r>
         <w:rPr>
           <w:rFonts w:ascii="Arial Bold" w:hAnsi="Arial Bold"/>
           <w:b/>
@@ -6104,7 +6040,8 @@
           <w:sz w:val="28"/>
           <w:lang w:eastAsia="en-US"/>
         </w:rPr>
-      </w:pPr>
+        <w:t xml:space="preserve">jercicio </w:t>
+      </w:r>
       <w:r>
         <w:rPr>
           <w:rFonts w:ascii="Arial Bold" w:hAnsi="Arial Bold"/>
@@ -6113,37 +6050,7 @@
           <w:sz w:val="28"/>
           <w:lang w:eastAsia="en-US"/>
         </w:rPr>
-        <w:t>E</w:t>
-      </w:r>
-      <w:r>
-        <w:rPr>
-          <w:rFonts w:ascii="Arial Bold" w:hAnsi="Arial Bold"/>
-          <w:b/>
-          <w:bCs/>
-          <w:sz w:val="28"/>
-          <w:lang w:eastAsia="en-US"/>
-        </w:rPr>
-        <w:t xml:space="preserve">jercicio </w:t>
-      </w:r>
-      <w:r>
-        <w:rPr>
-          <w:rFonts w:ascii="Arial Bold" w:hAnsi="Arial Bold"/>
-          <w:b/>
-          <w:bCs/>
-          <w:sz w:val="28"/>
-          <w:lang w:eastAsia="en-US"/>
-        </w:rPr>
-        <w:t>1</w:t>
-      </w:r>
-      <w:r>
-        <w:rPr>
-          <w:rFonts w:ascii="Arial Bold" w:hAnsi="Arial Bold"/>
-          <w:b/>
-          <w:bCs/>
-          <w:sz w:val="28"/>
-          <w:lang w:eastAsia="en-US"/>
-        </w:rPr>
-        <w:t xml:space="preserve">1. </w:t>
+        <w:t xml:space="preserve">11. </w:t>
       </w:r>
       <w:r>
         <w:rPr>

</xml_diff>